<commit_message>
fix: restore FR222 possible audit dates
Co-Authored-By: Claude Opus 4.6 (1M context) <noreply@anthropic.com>
</commit_message>
<xml_diff>
--- a/backend/uaf_blank_set/13485/Initial Certification /Stage 1/FR.222_Audit Programı R7&09.10.2025.docx
+++ b/backend/uaf_blank_set/13485/Initial Certification /Stage 1/FR.222_Audit Programı R7&09.10.2025.docx
@@ -6062,6 +6062,152 @@
                 <w:lang w:val="en-US"/>
               </w:rPr>
               <w:t>Recertification</w:t>
+            </w:r>
+          </w:p>
+        </w:tc>
+      </w:tr>
+      <w:tr>
+        <w:tblPrEx>
+          <w:tblBorders>
+            <w:top w:val="single" w:sz="4" w:space="0" w:color="auto"/>
+            <w:left w:val="single" w:sz="4" w:space="0" w:color="auto"/>
+            <w:bottom w:val="single" w:sz="4" w:space="0" w:color="auto"/>
+            <w:right w:val="single" w:sz="4" w:space="0" w:color="auto"/>
+          </w:tblBorders>
+          <w:tblCellMar>
+            <w:left w:w="108" w:type="dxa"/>
+            <w:right w:w="108" w:type="dxa"/>
+          </w:tblCellMar>
+          <w:tblLook w:val="01E0" w:firstRow="1" w:lastRow="1" w:firstColumn="1" w:lastColumn="1" w:noHBand="0" w:noVBand="0"/>
+        </w:tblPrEx>
+        <w:trPr>
+          <w:trHeight w:val="284"/>
+        </w:trPr>
+        <w:tc>
+          <w:tcPr>
+            <w:tcW w:w="2011" w:type="dxa"/>
+            <w:vMerge w:val="restart"/>
+            <w:tcBorders>
+              <w:top w:val="single" w:sz="4" w:space="0" w:color="auto"/>
+              <w:left w:val="single" w:sz="4" w:space="0" w:color="auto"/>
+              <w:right w:val="single" w:sz="4" w:space="0" w:color="auto"/>
+            </w:tcBorders>
+            <w:vAlign w:val="center"/>
+            <w:hideMark/>
+          </w:tcPr>
+          <w:p>
+            <w:pPr>
+              <w:jc w:val="center"/>
+            </w:pPr>
+            <w:r/>
+          </w:p>
+        </w:tc>
+        <w:tc>
+          <w:tcPr>
+            <w:tcW w:w="1276" w:type="dxa"/>
+            <w:gridSpan w:val="2"/>
+            <w:tcBorders>
+              <w:top w:val="single" w:sz="4" w:space="0" w:color="auto"/>
+              <w:left w:val="single" w:sz="4" w:space="0" w:color="auto"/>
+              <w:bottom w:val="single" w:sz="4" w:space="0" w:color="auto"/>
+              <w:right w:val="single" w:sz="4" w:space="0" w:color="auto"/>
+            </w:tcBorders>
+            <w:vAlign w:val="center"/>
+            <w:hideMark/>
+          </w:tcPr>
+          <w:p>
+            <w:pPr>
+              <w:jc w:val="center"/>
+            </w:pPr>
+            <w:r>
+              <w:t>{{ stage1_dates }}</w:t>
+            </w:r>
+          </w:p>
+        </w:tc>
+        <w:tc>
+          <w:tcPr>
+            <w:tcW w:w="1365" w:type="dxa"/>
+            <w:gridSpan w:val="3"/>
+            <w:tcBorders>
+              <w:top w:val="single" w:sz="4" w:space="0" w:color="auto"/>
+              <w:left w:val="single" w:sz="4" w:space="0" w:color="auto"/>
+              <w:bottom w:val="single" w:sz="4" w:space="0" w:color="auto"/>
+              <w:right w:val="single" w:sz="4" w:space="0" w:color="auto"/>
+            </w:tcBorders>
+            <w:vAlign w:val="center"/>
+          </w:tcPr>
+          <w:p>
+            <w:pPr>
+              <w:jc w:val="center"/>
+            </w:pPr>
+            <w:r>
+              <w:t>{{ stage2_dates }}</w:t>
+            </w:r>
+          </w:p>
+        </w:tc>
+        <w:tc>
+          <w:tcPr>
+            <w:tcW w:w="1142" w:type="dxa"/>
+            <w:gridSpan w:val="2"/>
+            <w:tcBorders>
+              <w:top w:val="single" w:sz="4" w:space="0" w:color="auto"/>
+              <w:left w:val="single" w:sz="4" w:space="0" w:color="auto"/>
+              <w:bottom w:val="single" w:sz="4" w:space="0" w:color="auto"/>
+              <w:right w:val="single" w:sz="4" w:space="0" w:color="auto"/>
+            </w:tcBorders>
+            <w:vAlign w:val="center"/>
+            <w:hideMark/>
+          </w:tcPr>
+          <w:p>
+            <w:pPr>
+              <w:jc w:val="center"/>
+            </w:pPr>
+            <w:r>
+              <w:t>{{ surv1_estimated_date }}</w:t>
+            </w:r>
+          </w:p>
+        </w:tc>
+        <w:tc>
+          <w:tcPr>
+            <w:tcW w:w="1870" w:type="dxa"/>
+            <w:gridSpan w:val="3"/>
+            <w:tcBorders>
+              <w:top w:val="single" w:sz="4" w:space="0" w:color="auto"/>
+              <w:left w:val="single" w:sz="4" w:space="0" w:color="auto"/>
+              <w:bottom w:val="single" w:sz="4" w:space="0" w:color="auto"/>
+              <w:right w:val="single" w:sz="4" w:space="0" w:color="auto"/>
+            </w:tcBorders>
+            <w:vAlign w:val="center"/>
+            <w:hideMark/>
+          </w:tcPr>
+          <w:p>
+            <w:pPr>
+              <w:jc w:val="center"/>
+            </w:pPr>
+            <w:r>
+              <w:t>{{ surv2_estimated_date }}</w:t>
+            </w:r>
+          </w:p>
+        </w:tc>
+        <w:tc>
+          <w:tcPr>
+            <w:tcW w:w="2248" w:type="dxa"/>
+            <w:gridSpan w:val="2"/>
+            <w:tcBorders>
+              <w:top w:val="single" w:sz="4" w:space="0" w:color="auto"/>
+              <w:left w:val="single" w:sz="4" w:space="0" w:color="auto"/>
+              <w:bottom w:val="single" w:sz="4" w:space="0" w:color="auto"/>
+              <w:right w:val="single" w:sz="4" w:space="0" w:color="auto"/>
+            </w:tcBorders>
+            <w:vAlign w:val="center"/>
+            <w:hideMark/>
+          </w:tcPr>
+          <w:p>
+            <w:pPr>
+              <w:jc w:val="center"/>
+            </w:pPr>
+            <w:r>
+              <w:t>{{ recert_estimated_date }}</w:t>
             </w:r>
           </w:p>
         </w:tc>

</xml_diff>